<commit_message>
feat: add scheduled task deletion and Medhesa icon
Expose scheduled task removal in the application and use the updated image for builds.

Co-authored-by: Copilot <223556219+Copilot@users.noreply.github.com>
</commit_message>
<xml_diff>
--- a/MANUAL DE USO - Informe diario de precios.docx
+++ b/MANUAL DE USO - Informe diario de precios.docx
@@ -49,20 +49,70 @@
         <w:jc w:val="center"/>
       </w:pPr>
       <w:r>
-        <w:t>Ayuntamiento de Medinas de Rioseco · Atención al Cliente</w:t>
+        <w:t>Atención al Cliente</w:t>
       </w:r>
     </w:p>
     <w:p>
       <w:pPr>
         <w:spacing w:after="40"/>
         <w:jc w:val="center"/>
-      </w:pPr>
+        <w:rPr>
+          <w:color w:val="555555"/>
+          <w:sz w:val="20"/>
+        </w:rPr>
+      </w:pPr>
+      <w:proofErr w:type="spellStart"/>
       <w:r>
         <w:rPr>
           <w:color w:val="555555"/>
           <w:sz w:val="20"/>
         </w:rPr>
-        <w:t>Versión 1.0 · 28 de septiembre de 2026</w:t>
+        <w:t>Versión</w:t>
+      </w:r>
+      <w:proofErr w:type="spellEnd"/>
+      <w:r>
+        <w:rPr>
+          <w:color w:val="555555"/>
+          <w:sz w:val="20"/>
+        </w:rPr>
+        <w:t xml:space="preserve"> 1.0 · </w:t>
+      </w:r>
+      <w:r>
+        <w:rPr>
+          <w:color w:val="555555"/>
+          <w:sz w:val="20"/>
+        </w:rPr>
+        <w:t>09</w:t>
+      </w:r>
+      <w:r>
+        <w:rPr>
+          <w:color w:val="555555"/>
+          <w:sz w:val="20"/>
+        </w:rPr>
+        <w:t xml:space="preserve"> de </w:t>
+      </w:r>
+      <w:proofErr w:type="spellStart"/>
+      <w:r>
+        <w:rPr>
+          <w:color w:val="555555"/>
+          <w:sz w:val="20"/>
+        </w:rPr>
+        <w:t>octu</w:t>
+      </w:r>
+      <w:r>
+        <w:rPr>
+          <w:color w:val="555555"/>
+          <w:sz w:val="20"/>
+        </w:rPr>
+        <w:t>bre</w:t>
+      </w:r>
+      <w:proofErr w:type="spellEnd"/>
+      <w:r>
+        <w:rPr>
+          <w:color w:val="555555"/>
+          <w:sz w:val="20"/>
+        </w:rPr>
+        <w:t xml:space="preserve"> de 2026</w:t>
       </w:r>
     </w:p>
     <w:p>
@@ -196,7 +246,15 @@
     </w:p>
     <w:p>
       <w:r>
-        <w:t>La aplicación prepara, cada día laborable, el informe de precios de la electricidad y del gas en un PDF y lo envía por correo a la lista de destinatarios que se haya configurado. Los datos proceden de OMIE, MIBGAS y OMIP, y se descargan de internet en el momento de generar el informe.</w:t>
+        <w:t xml:space="preserve">La aplicación prepara, cada día laborable, el informe de precios de la electricidad y del gas en </w:t>
+      </w:r>
+      <w:proofErr w:type="gramStart"/>
+      <w:r>
+        <w:t>un PDF</w:t>
+      </w:r>
+      <w:proofErr w:type="gramEnd"/>
+      <w:r>
+        <w:t xml:space="preserve"> y lo envía por correo a la lista de destinatarios que se haya configurado. Los datos proceden de OMIE, MIBGAS y OMIP, y se descargan de internet en el momento de generar el informe.</w:t>
       </w:r>
     </w:p>
     <w:p>
@@ -277,7 +335,15 @@
         <w:spacing w:after="60"/>
       </w:pPr>
       <w:r>
-        <w:t>Tener conexión a internet: los precios se descargan al generar el informe.</w:t>
+        <w:t xml:space="preserve">Tener conexión </w:t>
+      </w:r>
+      <w:proofErr w:type="gramStart"/>
+      <w:r>
+        <w:t>a</w:t>
+      </w:r>
+      <w:proofErr w:type="gramEnd"/>
+      <w:r>
+        <w:t xml:space="preserve"> internet: los precios se descargan al generar el informe.</w:t>
       </w:r>
     </w:p>
     <w:p>
@@ -467,12 +533,28 @@
     </w:p>
     <w:p>
       <w:r>
-        <w:t>Mientras la ventana de control esté abierta, la aplicación está funcionando. Si la cierras, deja de estar disponible hasta que la vuelvas a abrir.</w:t>
+        <w:t xml:space="preserve">Mientras la ventana de control esté abierta, la aplicación está funcionando. Si la cierras, deja de estar disponible hasta que la vuelvas </w:t>
+      </w:r>
+      <w:proofErr w:type="gramStart"/>
+      <w:r>
+        <w:t>a</w:t>
+      </w:r>
+      <w:proofErr w:type="gramEnd"/>
+      <w:r>
+        <w:t xml:space="preserve"> abrir.</w:t>
       </w:r>
     </w:p>
     <w:p>
       <w:r>
-        <w:t>Si la aplicación ya estaba abierta y haces doble clic otra vez en el ejecutable, no se abre una segunda copia: simplemente se vuelve a abrir el navegador.</w:t>
+        <w:t xml:space="preserve">Si la aplicación ya estaba abierta y haces doble clic otra vez en el ejecutable, no se abre una segunda copia: simplemente se vuelve </w:t>
+      </w:r>
+      <w:proofErr w:type="gramStart"/>
+      <w:r>
+        <w:t>a</w:t>
+      </w:r>
+      <w:proofErr w:type="gramEnd"/>
+      <w:r>
+        <w:t xml:space="preserve"> abrir el navegador.</w:t>
       </w:r>
     </w:p>
     <w:p>
@@ -516,7 +598,15 @@
     </w:p>
     <w:p>
       <w:r>
-        <w:t>Al seleccionar un informe, este bloque indica a quién se va a enviar. El botón «Enviar informe seleccionado» manda ese PDF a todos los correos de la lista de envío.</w:t>
+        <w:t xml:space="preserve">Al seleccionar un informe, este bloque indica a quién se va </w:t>
+      </w:r>
+      <w:proofErr w:type="gramStart"/>
+      <w:r>
+        <w:t>a</w:t>
+      </w:r>
+      <w:proofErr w:type="gramEnd"/>
+      <w:r>
+        <w:t xml:space="preserve"> enviar. El botón «Enviar informe seleccionado» manda ese PDF a todos los correos de la lista de envío.</w:t>
       </w:r>
     </w:p>
     <w:p>
@@ -613,7 +703,15 @@
         <w:spacing w:after="60"/>
       </w:pPr>
       <w:r>
-        <w:t>Para quitar a alguien: pulsa el botón «?» que aparece a la derecha de su correo y confirma el borrado.</w:t>
+        <w:t xml:space="preserve">Para quitar </w:t>
+      </w:r>
+      <w:proofErr w:type="gramStart"/>
+      <w:r>
+        <w:t>a</w:t>
+      </w:r>
+      <w:proofErr w:type="gramEnd"/>
+      <w:r>
+        <w:t xml:space="preserve"> alguien: pulsa el botón «?» que aparece a la derecha de su correo y confirma el borrado.</w:t>
       </w:r>
     </w:p>
     <w:p>
@@ -681,8 +779,20 @@
     </w:p>
     <w:p>
       <w:pPr>
+        <w:pStyle w:val="Listaconvietas"/>
         <w:spacing w:after="0"/>
       </w:pPr>
+      <w:r>
+        <w:t xml:space="preserve">Para eliminar la tarea programada por completo, </w:t>
+      </w:r>
+      <w:proofErr w:type="gramStart"/>
+      <w:r>
+        <w:t>pulsa ?Eliminar</w:t>
+      </w:r>
+      <w:proofErr w:type="gramEnd"/>
+      <w:r>
+        <w:t xml:space="preserve"> tarea programada? y confirma.</w:t>
+      </w:r>
     </w:p>
     <w:p>
       <w:r>
@@ -748,7 +858,15 @@
         <w:spacing w:after="60"/>
       </w:pPr>
       <w:r>
-        <w:t>Si hay algún error, vuelve a intentarlo por la tarde: alguno de los sitios de origen puede estar caído.</w:t>
+        <w:t xml:space="preserve">Si hay algún error, vuelve </w:t>
+      </w:r>
+      <w:proofErr w:type="gramStart"/>
+      <w:r>
+        <w:t>a</w:t>
+      </w:r>
+      <w:proofErr w:type="gramEnd"/>
+      <w:r>
+        <w:t xml:space="preserve"> intentarlo por la tarde: alguno de los sitios de origen puede estar caído.</w:t>
       </w:r>
     </w:p>
     <w:p>
@@ -868,7 +986,15 @@
     </w:p>
     <w:p>
       <w:r>
-        <w:t>El envío automático no manda un informe incompleto. En su lugar, avisa internamente a tbrellenthin@medhesa.es con el asunto «ALERTA: Informe diario NO enviado (datos incompletos)» y la lista de lo que falta. Para que ese aviso llegue, Outlook debe tener sesión iniciada en el equipo.</w:t>
+        <w:t xml:space="preserve">El envío automático no manda un informe incompleto. En su lugar, avisa internamente a tbrellenthin@medhesa.es con el asunto «ALERTA: Informe diario NO enviado (datos </w:t>
+      </w:r>
+      <w:proofErr w:type="gramStart"/>
+      <w:r>
+        <w:t>incompletos)»</w:t>
+      </w:r>
+      <w:proofErr w:type="gramEnd"/>
+      <w:r>
+        <w:t xml:space="preserve"> y la lista de lo que falta. Para que ese aviso llegue, Outlook debe tener sesión iniciada en el equipo.</w:t>
       </w:r>
     </w:p>
     <w:p>
@@ -1120,7 +1246,21 @@
               <w:rPr>
                 <w:sz w:val="20"/>
               </w:rPr>
-              <w:t>La aplicación ya está abierta en otra ventana. Ciérrala del todo y vuelve a abrirla, o simplemente usa el navegador, que sigue funcionando.</w:t>
+              <w:t xml:space="preserve">La aplicación ya está abierta en otra ventana. Ciérrala del todo y vuelve </w:t>
+            </w:r>
+            <w:proofErr w:type="gramStart"/>
+            <w:r>
+              <w:rPr>
+                <w:sz w:val="20"/>
+              </w:rPr>
+              <w:t>a</w:t>
+            </w:r>
+            <w:proofErr w:type="gramEnd"/>
+            <w:r>
+              <w:rPr>
+                <w:sz w:val="20"/>
+              </w:rPr>
+              <w:t xml:space="preserve"> abrirla, o simplemente usa el navegador, que sigue funcionando.</w:t>
             </w:r>
           </w:p>
         </w:tc>
@@ -1151,7 +1291,21 @@
               <w:rPr>
                 <w:sz w:val="20"/>
               </w:rPr>
-              <w:t>Tienes abierto «Contactos Envio Diario.xlsx». Ciérralo en Excel y vuelve a intentarlo.</w:t>
+              <w:t xml:space="preserve">Tienes abierto «Contactos Envio Diario.xlsx». Ciérralo en Excel y vuelve </w:t>
+            </w:r>
+            <w:proofErr w:type="gramStart"/>
+            <w:r>
+              <w:rPr>
+                <w:sz w:val="20"/>
+              </w:rPr>
+              <w:t>a</w:t>
+            </w:r>
+            <w:proofErr w:type="gramEnd"/>
+            <w:r>
+              <w:rPr>
+                <w:sz w:val="20"/>
+              </w:rPr>
+              <w:t xml:space="preserve"> intentarlo.</w:t>
             </w:r>
           </w:p>
         </w:tc>
@@ -1213,7 +1367,49 @@
               <w:rPr>
                 <w:sz w:val="20"/>
               </w:rPr>
-              <w:t>Espera unos minutos. Si a los diez minutos sigue igual, comprueba la conexión a internet y vuelve a intentarlo. No pulses el botón repetidamente: cada intento vuelve a empezar la descarga.</w:t>
+              <w:t xml:space="preserve">Espera unos minutos. Si a los diez minutos sigue igual, comprueba la conexión </w:t>
+            </w:r>
+            <w:proofErr w:type="gramStart"/>
+            <w:r>
+              <w:rPr>
+                <w:sz w:val="20"/>
+              </w:rPr>
+              <w:t>a</w:t>
+            </w:r>
+            <w:proofErr w:type="gramEnd"/>
+            <w:r>
+              <w:rPr>
+                <w:sz w:val="20"/>
+              </w:rPr>
+              <w:t xml:space="preserve"> internet y vuelve </w:t>
+            </w:r>
+            <w:proofErr w:type="gramStart"/>
+            <w:r>
+              <w:rPr>
+                <w:sz w:val="20"/>
+              </w:rPr>
+              <w:t>a</w:t>
+            </w:r>
+            <w:proofErr w:type="gramEnd"/>
+            <w:r>
+              <w:rPr>
+                <w:sz w:val="20"/>
+              </w:rPr>
+              <w:t xml:space="preserve"> intentarlo. No pulses el botón repetidamente: cada intento vuelve </w:t>
+            </w:r>
+            <w:proofErr w:type="gramStart"/>
+            <w:r>
+              <w:rPr>
+                <w:sz w:val="20"/>
+              </w:rPr>
+              <w:t>a</w:t>
+            </w:r>
+            <w:proofErr w:type="gramEnd"/>
+            <w:r>
+              <w:rPr>
+                <w:sz w:val="20"/>
+              </w:rPr>
+              <w:t xml:space="preserve"> empezar la descarga.</w:t>
             </w:r>
           </w:p>
         </w:tc>
@@ -1275,7 +1471,21 @@
               <w:rPr>
                 <w:sz w:val="20"/>
               </w:rPr>
-              <w:t>El ejecutable no está firmado. Pulsa «Más información» y «Ejecutar de todas formas». No lo abras si el aviso viene del antivirus: avisa antes a informática.</w:t>
+              <w:t xml:space="preserve">El ejecutable no está firmado. Pulsa «Más información» y «Ejecutar de todas formas». No lo abras si el aviso viene del antivirus: avisa antes </w:t>
+            </w:r>
+            <w:proofErr w:type="gramStart"/>
+            <w:r>
+              <w:rPr>
+                <w:sz w:val="20"/>
+              </w:rPr>
+              <w:t>a</w:t>
+            </w:r>
+            <w:proofErr w:type="gramEnd"/>
+            <w:r>
+              <w:rPr>
+                <w:sz w:val="20"/>
+              </w:rPr>
+              <w:t xml:space="preserve"> informática.</w:t>
             </w:r>
           </w:p>
         </w:tc>
@@ -1607,19 +1817,10 @@
         <w:t>Los nombres de los PDF siguen el formato «Informe Precio Diario DD.MM.AAAA.pdf», donde la fecha es el día al que corresponde el informe, no el día en que se generó.</w:t>
       </w:r>
     </w:p>
-    <w:p/>
     <w:p>
       <w:pPr>
         <w:jc w:val="center"/>
       </w:pPr>
-      <w:r>
-        <w:rPr>
-          <w:i/>
-          <w:color w:val="555555"/>
-          <w:sz w:val="18"/>
-        </w:rPr>
-        <w:t>Manual de uso de la aplicación de escritorio «Informe diario de precios energéticos» · versión 1.0 · 28 de septiembre de 2026</w:t>
-      </w:r>
     </w:p>
     <w:sectPr>
       <w:footerReference w:type="default" r:id="rId8"/>

</xml_diff>